<commit_message>
Update Build Plan and Decision Log: mark Geopolitics/Trust & AI Safety publish gap resolved
</commit_message>
<xml_diff>
--- a/Build_Plan.docx
+++ b/Build_Plan.docx
@@ -47,7 +47,7 @@
           <w:sz w:val="20"/>
           <w:szCs w:val="20"/>
         </w:rPr>
-        <w:t xml:space="preserve">DRAFT — not yet reviewed by the team or submitted · prepared by Kyran Weijman, with Claude · 2026-10-19 · originally due Mon 5 Oct 2026</w:t>
+        <w:t xml:space="preserve">DRAFT — not yet reviewed by the team or submitted · prepared by Kyran Weijman, with Claude · 2026-10-19 · originally due Mon 5 Oct 2026 · updated 2026-10-23</w:t>
       </w:r>
     </w:p>
     <w:p>
@@ -1588,7 +1588,7 @@
           <w:sz w:val="24"/>
           <w:szCs w:val="24"/>
         </w:rPr>
-        <w:t xml:space="preserve">Phase 11 — NEXT: the confidentiality gate and the live-site publish gap  (not started)  [NEXT]</w:t>
+        <w:t xml:space="preserve">Phase 11 — the confidentiality gate (not started); live-site publish gap RESOLVED 2026-10-23  [NEXT]</w:t>
       </w:r>
     </w:p>
     <w:p>
@@ -1656,7 +1656,7 @@
           <w:sz w:val="21"/>
           <w:szCs w:val="21"/>
         </w:rPr>
-        <w:t xml:space="preserve">Publish Trust &amp; AI Safety to the live site, or confirm with the tutor that “assess AI suppliers” is an accepted substitute for week 3's theme — the only remaining publish gap now (Geopolitics was found republished independently on 2026-10-21: docs/handbook/ on the live repo lists all 4 original pages again, including Geopolitics, from a commit dated roughly 2026-10-19/20 — outside this project's own sessions, cause not confirmed) — requires Kyran's explicit go-ahead before anything is pushed to the shared repo again</w:t>
+        <w:t xml:space="preserve">Publish Trust &amp; AI Safety to the live site — DONE 2026-10-23. Kyran provided the real Trust and AI Safety Word document; it was converted into a wiki page matching the Geopolitics page's format (status: APPROVED, approved_by Kyran Weijman), and the old “assess AI suppliers” page was retired (status: SUPERSEDED in the wiki source, not deleted — restorable) rather than left live, since it did not match week 3's official theme. Published to docs/handbook/ and the index regenerated, pushed to the shared GitHub repo (main, via browser) with Kyran's explicit go-ahead, and confirmed live on the public site (all 4 pages now match weeks 2–5: Geopolitics, Trust and AI Safety, SME knowledge gaps, AI use cases).</w:t>
       </w:r>
     </w:p>
     <w:p>
@@ -1679,7 +1679,7 @@
           <w:sz w:val="22"/>
           <w:szCs w:val="22"/>
         </w:rPr>
-        <w:t xml:space="preserve">Not yet run.</w:t>
+        <w:t xml:space="preserve">Confidentiality gate: not yet run — still queued. Live-site publish gap: confirmed resolved 2026-10-23 — the live handbook site was checked directly and shows the correct 4 pages; see the Decision Log entry dated 2026-10-23.</w:t>
       </w:r>
     </w:p>
     <w:p>
@@ -2509,7 +2509,7 @@
                 <w:sz w:val="19"/>
                 <w:szCs w:val="19"/>
               </w:rPr>
-              <w:t xml:space="preserve">publish_wiki.py + GitHub Actions workflow (Phase 7) — live, with a known publish gap (Phase 11)</w:t>
+              <w:t xml:space="preserve">publish_wiki.py + GitHub Actions workflow (Phase 7) — live; the Phase 11 publish gap is resolved (2026-10-23)</w:t>
             </w:r>
           </w:p>
         </w:tc>

</xml_diff>